<commit_message>
Update Dr. Dormani full name on EN Salon Academy cover page
</commit_message>
<xml_diff>
--- a/Hybrid_Salon_Academy_Analysis_EN_2026-04-11.docx
+++ b/Hybrid_Salon_Academy_Analysis_EN_2026-04-11.docx
@@ -158,65 +158,48 @@
       <w:r>
         <w:rPr>
           <w:rFonts w:ascii="Georgia" w:cs="Georgia" w:eastAsia="Georgia" w:hAnsi="Georgia"/>
+          <w:color w:val="3A4A5C"/>
+          <w:sz w:val="18"/>
+          <w:szCs w:val="18"/>
+        </w:rPr>
+        <w:t xml:space="preserve">IBPROM Corp</w:t>
+      </w:r>
+    </w:p>
+    <w:p>
+      <w:pPr>
+        <w:spacing w:after="160"/>
+      </w:pPr>
+    </w:p>
+    <w:p>
+      <w:pPr>
+        <w:spacing w:after="40"/>
+        <w:jc w:val="center"/>
+      </w:pPr>
+      <w:r>
+        <w:rPr>
+          <w:rFonts w:ascii="Georgia" w:cs="Georgia" w:eastAsia="Georgia" w:hAnsi="Georgia"/>
+          <w:color w:val="3A4A5C"/>
+          <w:sz w:val="16"/>
+          <w:szCs w:val="16"/>
+        </w:rPr>
+        <w:t xml:space="preserve">Prepared for</w:t>
+      </w:r>
+    </w:p>
+    <w:p>
+      <w:pPr>
+        <w:spacing w:after="40"/>
+        <w:jc w:val="center"/>
+      </w:pPr>
+      <w:r>
+        <w:rPr>
+          <w:rFonts w:ascii="Georgia" w:cs="Georgia" w:eastAsia="Georgia" w:hAnsi="Georgia"/>
           <w:b/>
           <w:bCs/>
           <w:color w:val="0C1A2E"/>
           <w:sz w:val="22"/>
           <w:szCs w:val="22"/>
         </w:rPr>
-        <w:t>GABRIEL ANDINO, BA, Economic Analyst</w:t>
-      </w:r>
-    </w:p>
-    <w:p>
-      <w:pPr>
-        <w:spacing w:after="40"/>
-        <w:jc w:val="center"/>
-      </w:pPr>
-      <w:r>
-        <w:rPr>
-          <w:rFonts w:ascii="Georgia" w:cs="Georgia" w:eastAsia="Georgia" w:hAnsi="Georgia"/>
-          <w:color w:val="3A4A5C"/>
-          <w:sz w:val="18"/>
-          <w:szCs w:val="18"/>
-        </w:rPr>
-        <w:t xml:space="preserve">IBPROM Corp</w:t>
-      </w:r>
-    </w:p>
-    <w:p>
-      <w:pPr>
-        <w:spacing w:after="160"/>
-      </w:pPr>
-    </w:p>
-    <w:p>
-      <w:pPr>
-        <w:spacing w:after="40"/>
-        <w:jc w:val="center"/>
-      </w:pPr>
-      <w:r>
-        <w:rPr>
-          <w:rFonts w:ascii="Georgia" w:cs="Georgia" w:eastAsia="Georgia" w:hAnsi="Georgia"/>
-          <w:color w:val="3A4A5C"/>
-          <w:sz w:val="16"/>
-          <w:szCs w:val="16"/>
-        </w:rPr>
-        <w:t xml:space="preserve">Prepared for</w:t>
-      </w:r>
-    </w:p>
-    <w:p>
-      <w:pPr>
-        <w:spacing w:after="40"/>
-        <w:jc w:val="center"/>
-      </w:pPr>
-      <w:r>
-        <w:rPr>
-          <w:rFonts w:ascii="Georgia" w:cs="Georgia" w:eastAsia="Georgia" w:hAnsi="Georgia"/>
-          <w:b/>
-          <w:bCs/>
-          <w:color w:val="0C1A2E"/>
-          <w:sz w:val="22"/>
-          <w:szCs w:val="22"/>
-        </w:rPr>
-        <w:t xml:space="preserve">DR. NADER DORMANI</w:t>
+        <w:t xml:space="preserve">DR. NADER AGHARAZI-DORMANI</w:t>
       </w:r>
     </w:p>
     <w:p>
@@ -3109,6 +3092,7 @@
     <w:p>
       <w:pPr>
         <w:pStyle w:val="Heading2"/>
+        <w:pageBreakBefore/>
         <w:spacing w:after="160" w:before="280"/>
       </w:pPr>
       <w:r>
@@ -3156,18 +3140,7 @@
           <w:sz w:val="22"/>
           <w:szCs w:val="22"/>
         </w:rPr>
-        <w:t xml:space="preserve">The Gatineau downtown core lost approximately 60% of its federal workforce between 2016 and 2021, declining from 36,000 to 14,460 workers. </w:t>
-      </w:r>
-      <w:r>
-        <w:rPr>
-          <w:rFonts w:ascii="Georgia" w:cs="Georgia" w:eastAsia="Georgia" w:hAnsi="Georgia"/>
-          <w:b w:val="false"/>
-          <w:bCs w:val="false"/>
-          <w:color w:val="3A4A5C"/>
-          <w:sz w:val="22"/>
-          <w:szCs w:val="22"/>
-        </w:rPr>
-        <w:t xml:space="preserve">This collapse was driven by two factors: (1) federal government work-from-home policies initiated during COVID-19, and (2) the Place du Portage III renovation project (2018–2028) managed by Public Services and Procurement Canada (PSPC), which has progressively reduced available office space and forced tenant relocations.</w:t>
+        <w:t>The Gatineau downtown core lost approximately 60% of its federal workforce between 2016 and 2021, declining from 36,000 to 14,460 workers. This collapse was driven by two factors: (1) federal government work-from-home policies initiated during COVID-19, and (2) the Place du Portage III renovation project (2018–2028) managed by Public Services and Procurement Canada (PSPC), which has progressively reduced available office space and forced tenant relocations.</w:t>
       </w:r>
     </w:p>
     <w:p>
@@ -6214,59 +6187,58 @@
     </w:p>
     <w:p>
       <w:pPr>
-        <w:spacing w:after="200"/>
-        <w:jc w:val="both"/>
+        <w:spacing w:after="40"/>
       </w:pPr>
       <w:r>
         <w:rPr>
           <w:rFonts w:ascii="Georgia" w:cs="Georgia" w:eastAsia="Georgia" w:hAnsi="Georgia"/>
           <w:b/>
           <w:bCs/>
-          <w:i w:val="false"/>
-          <w:iCs w:val="false"/>
           <w:color w:val="0C1A2E"/>
           <w:sz w:val="22"/>
           <w:szCs w:val="22"/>
         </w:rPr>
         <w:t>Joseph Soares, MBA, Adm.A., PMP</w:t>
-        <w:br/>
-        <w:t xml:space="preserve">Managing Partner</w:t>
-      </w:r>
-    </w:p>
-    <w:p>
-      <w:pPr>
-        <w:spacing w:after="200"/>
-        <w:jc w:val="both"/>
-      </w:pPr>
-      <w:r>
-        <w:rPr>
-          <w:rFonts w:ascii="Georgia" w:cs="Georgia" w:eastAsia="Georgia" w:hAnsi="Georgia"/>
-          <w:b w:val="false"/>
-          <w:bCs w:val="false"/>
-          <w:i w:val="false"/>
-          <w:iCs w:val="false"/>
+      </w:r>
+    </w:p>
+    <w:p>
+      <w:pPr>
+        <w:spacing w:after="40"/>
+      </w:pPr>
+      <w:r>
+        <w:rPr>
+          <w:rFonts w:ascii="Georgia" w:cs="Georgia" w:eastAsia="Georgia" w:hAnsi="Georgia"/>
           <w:color w:val="3A4A5C"/>
-          <w:sz w:val="22"/>
-          <w:szCs w:val="22"/>
-        </w:rPr>
-        <w:t xml:space="preserve">IBPROM Corp</w:t>
-      </w:r>
-    </w:p>
-    <w:p>
-      <w:pPr>
-        <w:spacing w:after="200"/>
-        <w:jc w:val="both"/>
-      </w:pPr>
-      <w:r>
-        <w:rPr>
-          <w:rFonts w:ascii="Georgia" w:cs="Georgia" w:eastAsia="Georgia" w:hAnsi="Georgia"/>
-          <w:b w:val="false"/>
-          <w:bCs w:val="false"/>
-          <w:i w:val="false"/>
-          <w:iCs w:val="false"/>
+          <w:sz w:val="20"/>
+          <w:szCs w:val="20"/>
+        </w:rPr>
+        <w:t>Managing Partner</w:t>
+      </w:r>
+    </w:p>
+    <w:p>
+      <w:pPr>
+        <w:spacing w:after="40"/>
+      </w:pPr>
+      <w:r>
+        <w:rPr>
+          <w:rFonts w:ascii="Georgia" w:cs="Georgia" w:eastAsia="Georgia" w:hAnsi="Georgia"/>
           <w:color w:val="3A4A5C"/>
-          <w:sz w:val="22"/>
-          <w:szCs w:val="22"/>
+          <w:sz w:val="20"/>
+          <w:szCs w:val="20"/>
+        </w:rPr>
+        <w:t>IBPROM Corp</w:t>
+      </w:r>
+    </w:p>
+    <w:p>
+      <w:pPr>
+        <w:spacing w:after="40"/>
+      </w:pPr>
+      <w:r>
+        <w:rPr>
+          <w:rFonts w:ascii="Georgia" w:cs="Georgia" w:eastAsia="Georgia" w:hAnsi="Georgia"/>
+          <w:color w:val="3A4A5C"/>
+          <w:sz w:val="20"/>
+          <w:szCs w:val="20"/>
         </w:rPr>
         <w:t>soares@ibprom.com</w:t>
       </w:r>
@@ -6299,57 +6271,152 @@
     <w:p>
       <w:pPr>
         <w:pageBreakBefore/>
-      </w:pPr>
-      <w:r>
-        <w:rPr>
+        <w:pBdr>
+          <w:bottom w:val="single" w:color="C9A84C" w:sz="6" w:space="8"/>
+        </w:pBdr>
+        <w:spacing w:after="300"/>
+      </w:pPr>
+      <w:r>
+        <w:rPr>
+          <w:rFonts w:ascii="Georgia" w:cs="Georgia" w:eastAsia="Georgia" w:hAnsi="Georgia"/>
           <w:b/>
+          <w:bCs/>
+          <w:color w:val="0C1A2E"/>
           <w:sz w:val="28"/>
+          <w:szCs w:val="28"/>
         </w:rPr>
         <w:t xml:space="preserve">References</w:t>
       </w:r>
     </w:p>
     <w:p>
-      <w:r>
-        <w:rPr/>
-        <w:t xml:space="preserve"/>
-      </w:r>
-    </w:p>
-    <w:p>
-      <w:r>
-        <w:rPr>
+      <w:pPr>
+        <w:spacing w:after="160"/>
+        <w:ind w:left="360" w:hanging="360"/>
+      </w:pPr>
+      <w:r>
+        <w:rPr>
+          <w:rFonts w:ascii="Georgia" w:cs="Georgia" w:eastAsia="Georgia" w:hAnsi="Georgia"/>
+          <w:color w:val="3A4A5C"/>
           <w:sz w:val="18"/>
-        </w:rPr>
-        <w:t xml:space="preserve">¹  Statistics Canada, Census Profile 2021 — Gatineau CMA. https://www12.statcan.gc.ca/census-recensement/2021/dp-pd/prof/details/page.cfm?Lang=E&amp;GeoUID=505&amp;DGUIDlist=2021A00053505</w:t>
-      </w:r>
-    </w:p>
-    <w:p>
-      <w:r>
-        <w:rPr>
+          <w:szCs w:val="18"/>
+        </w:rPr>
+        <w:t xml:space="preserve">1. Statistics Canada. “Census Profile, 2021 Census of Population: Gatineau CMA.” Government of Canada, 2022. </w:t>
+      </w:r>
+      <w:hyperlink r:id="rId10" w:history="1">
+        <w:r>
+          <w:rPr>
+            <w:rStyle w:val="Hyperlink"/>
+            <w:rFonts w:ascii="Georgia" w:cs="Georgia" w:eastAsia="Georgia" w:hAnsi="Georgia"/>
+            <w:color w:val="2E75B6"/>
+            <w:sz w:val="18"/>
+            <w:szCs w:val="18"/>
+            <w:u w:val="single"/>
+          </w:rPr>
+          <w:t>statcan.gc.ca</w:t>
+        </w:r>
+      </w:hyperlink>
+    </w:p>
+    <w:p>
+      <w:pPr>
+        <w:spacing w:after="160"/>
+        <w:ind w:left="360" w:hanging="360"/>
+      </w:pPr>
+      <w:r>
+        <w:rPr>
+          <w:rFonts w:ascii="Georgia" w:cs="Georgia" w:eastAsia="Georgia" w:hAnsi="Georgia"/>
+          <w:color w:val="3A4A5C"/>
           <w:sz w:val="18"/>
-        </w:rPr>
-        <w:t xml:space="preserve">²  Emploi-Québec, IMT en ligne (Information sur le marché du travail), Outaouais region, 2024–2026 outlook. https://www.quebec.ca/emploi/planification-gestion/information-marche-travail</w:t>
-      </w:r>
-    </w:p>
-    <w:p>
-      <w:r>
-        <w:rPr>
+          <w:szCs w:val="18"/>
+        </w:rPr>
+        <w:t xml:space="preserve">2. Emploi-Québec. “Information sur le marché du travail (IMT en ligne): Région de l’Outaouais, 2024–2026 Outlook.” Gouvernement du Québec. </w:t>
+      </w:r>
+      <w:hyperlink r:id="rId11" w:history="1">
+        <w:r>
+          <w:rPr>
+            <w:rStyle w:val="Hyperlink"/>
+            <w:rFonts w:ascii="Georgia" w:cs="Georgia" w:eastAsia="Georgia" w:hAnsi="Georgia"/>
+            <w:color w:val="2E75B6"/>
+            <w:sz w:val="18"/>
+            <w:szCs w:val="18"/>
+            <w:u w:val="single"/>
+          </w:rPr>
+          <w:t>quebec.ca</w:t>
+        </w:r>
+      </w:hyperlink>
+    </w:p>
+    <w:p>
+      <w:pPr>
+        <w:spacing w:after="160"/>
+        <w:ind w:left="360" w:hanging="360"/>
+      </w:pPr>
+      <w:r>
+        <w:rPr>
+          <w:rFonts w:ascii="Georgia" w:cs="Georgia" w:eastAsia="Georgia" w:hAnsi="Georgia"/>
+          <w:color w:val="3A4A5C"/>
           <w:sz w:val="18"/>
-        </w:rPr>
-        <w:t xml:space="preserve">³  Treasury Board of Canada Secretariat, Direction on Prescribed Presence in the Workplace, May 16, 2024. https://www.canada.ca/en/government/publicservice/workforce/direction-prescribed-presence-workplace.html</w:t>
-      </w:r>
-    </w:p>
-    <w:p>
-      <w:r>
-        <w:rPr>
+          <w:szCs w:val="18"/>
+        </w:rPr>
+        <w:t xml:space="preserve">3. Treasury Board of Canada Secretariat. “Direction on Prescribed Presence in the Workplace.” Government of Canada, May 16, 2024. </w:t>
+      </w:r>
+      <w:hyperlink r:id="rId12" w:history="1">
+        <w:r>
+          <w:rPr>
+            <w:rStyle w:val="Hyperlink"/>
+            <w:rFonts w:ascii="Georgia" w:cs="Georgia" w:eastAsia="Georgia" w:hAnsi="Georgia"/>
+            <w:color w:val="2E75B6"/>
+            <w:sz w:val="18"/>
+            <w:szCs w:val="18"/>
+            <w:u w:val="single"/>
+          </w:rPr>
+          <w:t>canada.ca</w:t>
+        </w:r>
+      </w:hyperlink>
+    </w:p>
+    <w:p>
+      <w:pPr>
+        <w:spacing w:after="160"/>
+        <w:ind w:left="360" w:hanging="360"/>
+      </w:pPr>
+      <w:r>
+        <w:rPr>
+          <w:rFonts w:ascii="Georgia" w:cs="Georgia" w:eastAsia="Georgia" w:hAnsi="Georgia"/>
+          <w:color w:val="3A4A5C"/>
           <w:sz w:val="18"/>
-        </w:rPr>
-        <w:t xml:space="preserve">⁴  Public Services and Procurement Canada, Place du Portage Phase III Renewal Project. https://www.canada.ca/en/public-services-procurement/services/infrastructure-buildings/construction/portage-3-renewal.html</w:t>
-      </w:r>
-    </w:p>
-    <w:p>
-      <w:r>
-        <w:rPr/>
-        <w:t xml:space="preserve"/>
+          <w:szCs w:val="18"/>
+        </w:rPr>
+        <w:t xml:space="preserve">4. Public Services and Procurement Canada. “Place du Portage Phase III Renewal Project.” Government of Canada. </w:t>
+      </w:r>
+      <w:hyperlink r:id="rId13" w:history="1">
+        <w:r>
+          <w:rPr>
+            <w:rStyle w:val="Hyperlink"/>
+            <w:rFonts w:ascii="Georgia" w:cs="Georgia" w:eastAsia="Georgia" w:hAnsi="Georgia"/>
+            <w:color w:val="2E75B6"/>
+            <w:sz w:val="18"/>
+            <w:szCs w:val="18"/>
+            <w:u w:val="single"/>
+          </w:rPr>
+          <w:t>canada.ca</w:t>
+        </w:r>
+      </w:hyperlink>
+    </w:p>
+    <w:p>
+      <w:pPr>
+        <w:pBdr>
+          <w:top w:val="single" w:color="C9A84C" w:sz="6" w:space="8"/>
+        </w:pBdr>
+        <w:spacing w:before="400"/>
+      </w:pPr>
+      <w:r>
+        <w:rPr>
+          <w:rFonts w:ascii="Georgia" w:cs="Georgia" w:eastAsia="Georgia" w:hAnsi="Georgia"/>
+          <w:i/>
+          <w:iCs/>
+          <w:color w:val="7A7568"/>
+          <w:sz w:val="16"/>
+          <w:szCs w:val="16"/>
+        </w:rPr>
+        <w:t xml:space="preserve">Disclaimer: This document has been prepared by IBPROM Corp for informational and strategic planning purposes only. It does not constitute legal, financial, or investment advice. The analysis is based on publicly available data and professional judgment as of the date of publication. While every effort has been made to ensure accuracy, IBPROM Corp makes no representations or warranties regarding the completeness or reliability of the information contained herein. Readers are advised to consult qualified professionals before making business decisions based on this document.</w:t>
       </w:r>
     </w:p>
     <w:sectPr>

</xml_diff>